<commit_message>
chore: polish comments and docs wording
</commit_message>
<xml_diff>
--- a/03_Docs/岔路口导航逻辑说明.docx
+++ b/03_Docs/岔路口导航逻辑说明.docx
@@ -1,5 +1,70 @@
 
-<file path=word/document.xml><?xml version="1.0" encoding="utf-8"?>
+<file path=customXml\item1.xml><?xml version="1.0" encoding="utf-8"?>
+<b:Sources xmlns:b="http://schemas.openxmlformats.org/officeDocument/2006/bibliography" xmlns="http://schemas.openxmlformats.org/officeDocument/2006/bibliography" SelectedStyle="/APA.XSL" StyleName="APA"/>
+</file>
+
+<file path=customXml\itemProps1.xml><?xml version="1.0" encoding="utf-8"?>
+<ds:datastoreItem xmlns:ds="http://schemas.openxmlformats.org/officeDocument/2006/customXml" ds:itemID="{EF278816-EC6F-A645-907D-7F25AECB1D4A}">
+  <ds:schemaRefs>
+    <ds:schemaRef ds:uri="http://schemas.openxmlformats.org/officeDocument/2006/bibliography"/>
+  </ds:schemaRefs>
+</ds:datastoreItem>
+</file>
+
+<file path=docProps\app.xml><?xml version="1.0" encoding="utf-8"?>
+<Properties xmlns="http://schemas.openxmlformats.org/officeDocument/2006/extended-properties" xmlns:vt="http://schemas.openxmlformats.org/officeDocument/2006/docPropsVTypes">
+  <Template>Normal.dotm</Template>
+  <TotalTime>0</TotalTime>
+  <Pages>1</Pages>
+  <Words>0</Words>
+  <Characters>0</Characters>
+  <Application>Microsoft Macintosh Word</Application>
+  <DocSecurity>0</DocSecurity>
+  <Lines>0</Lines>
+  <Paragraphs>0</Paragraphs>
+  <ScaleCrop>false</ScaleCrop>
+  <HeadingPairs>
+    <vt:vector size="2" baseType="variant">
+      <vt:variant>
+        <vt:lpstr>Title</vt:lpstr>
+      </vt:variant>
+      <vt:variant>
+        <vt:i4>1</vt:i4>
+      </vt:variant>
+    </vt:vector>
+  </HeadingPairs>
+  <TitlesOfParts>
+    <vt:vector size="1" baseType="lpstr">
+      <vt:lpstr/>
+    </vt:vector>
+  </TitlesOfParts>
+  <Manager/>
+  <Company/>
+  <LinksUpToDate>false</LinksUpToDate>
+  <CharactersWithSpaces>0</CharactersWithSpaces>
+  <SharedDoc>false</SharedDoc>
+  <HyperlinkBase/>
+  <HyperlinksChanged>false</HyperlinksChanged>
+  <AppVersion>14.0000</AppVersion>
+</Properties>
+</file>
+
+<file path=docProps\core.xml><?xml version="1.0" encoding="utf-8"?>
+<cp:coreProperties xmlns:cp="http://schemas.openxmlformats.org/package/2006/metadata/core-properties" xmlns:dc="http://purl.org/dc/elements/1.1/" xmlns:dcterms="http://purl.org/dc/terms/" xmlns:dcmitype="http://purl.org/dc/dcmitype/" xmlns:xsi="http://www.w3.org/2001/XMLSchema-instance">
+  <dc:title/>
+  <dc:subject/>
+  <dc:creator>python-docx</dc:creator>
+  <cp:keywords/>
+  <dc:description>generated by python-docx</dc:description>
+  <cp:lastModifiedBy/>
+  <cp:revision>1</cp:revision>
+  <dcterms:created xsi:type="dcterms:W3CDTF">2013-12-23T23:15:00Z</dcterms:created>
+  <dcterms:modified xsi:type="dcterms:W3CDTF">2013-12-23T23:15:00Z</dcterms:modified>
+  <cp:category/>
+</cp:coreProperties>
+</file>
+
+<file path=word\document.xml><?xml version="1.0" encoding="utf-8"?>
 <w:document xmlns:wpc="http://schemas.microsoft.com/office/word/2010/wordprocessingCanvas" xmlns:mo="http://schemas.microsoft.com/office/mac/office/2008/main" xmlns:mc="http://schemas.openxmlformats.org/markup-compatibility/2006" xmlns:mv="urn:schemas-microsoft-com:mac:vml" xmlns:o="urn:schemas-microsoft-com:office:office" xmlns:r="http://schemas.openxmlformats.org/officeDocument/2006/relationships" xmlns:m="http://schemas.openxmlformats.org/officeDocument/2006/math" xmlns:v="urn:schemas-microsoft-com:vml" xmlns:wp14="http://schemas.microsoft.com/office/word/2010/wordprocessingDrawing" xmlns:wp="http://schemas.openxmlformats.org/drawingml/2006/wordprocessingDrawing" xmlns:w10="urn:schemas-microsoft-com:office:word" xmlns:w="http://schemas.openxmlformats.org/wordprocessingml/2006/main" xmlns:w14="http://schemas.microsoft.com/office/word/2010/wordml" xmlns:wpg="http://schemas.microsoft.com/office/word/2010/wordprocessingGroup" xmlns:wpi="http://schemas.microsoft.com/office/word/2010/wordprocessingInk" xmlns:wne="http://schemas.microsoft.com/office/word/2006/wordml" xmlns:wps="http://schemas.microsoft.com/office/word/2010/wordprocessingShape" mc:Ignorable="w14 wp14">
   <w:body>
     <w:p>
@@ -13,7 +78,7 @@
     </w:p>
     <w:p>
       <w:r>
-        <w:t>项目：TC264D 智能车 — 并联电路赛道导航</w:t>
+        <w:t>项目：TC264D 移动机器人 — 并联电路赛道导航</w:t>
       </w:r>
     </w:p>
     <w:p>
@@ -32,7 +97,7 @@
     </w:p>
     <w:p>
       <w:r>
-        <w:t>比赛赛道为并联电路赛道，具有以下特点：</w:t>
+        <w:t>项目演示赛道为并联电路赛道，具有以下特点：</w:t>
       </w:r>
     </w:p>
     <w:p>
@@ -40,7 +105,7 @@
         <w:pStyle w:val="ListBullet"/>
       </w:pPr>
       <w:r>
-        <w:t>赛道未知：比赛前不知道赛道的具体布局</w:t>
+        <w:t>赛道未知：项目演示前不知道赛道的具体布局</w:t>
       </w:r>
     </w:p>
     <w:p>
@@ -2059,7 +2124,70 @@
 </w:document>
 </file>
 
-<file path=word/numbering.xml><?xml version="1.0" encoding="utf-8"?>
+<file path=word\fontTable.xml><?xml version="1.0" encoding="utf-8"?>
+<w:fonts xmlns:mc="http://schemas.openxmlformats.org/markup-compatibility/2006" xmlns:r="http://schemas.openxmlformats.org/officeDocument/2006/relationships" xmlns:w="http://schemas.openxmlformats.org/wordprocessingml/2006/main" xmlns:w14="http://schemas.microsoft.com/office/word/2010/wordml" mc:Ignorable="w14">
+  <w:font w:name="Symbol">
+    <w:panose1 w:val="00000000000000000000"/>
+    <w:charset w:val="02"/>
+    <w:family w:val="auto"/>
+    <w:pitch w:val="variable"/>
+    <w:sig w:usb0="00000000" w:usb1="10000000" w:usb2="00000000" w:usb3="00000000" w:csb0="80000000" w:csb1="00000000"/>
+  </w:font>
+  <w:font w:name="Times New Roman">
+    <w:panose1 w:val="02020603050405020304"/>
+    <w:charset w:val="00"/>
+    <w:family w:val="auto"/>
+    <w:pitch w:val="variable"/>
+    <w:sig w:usb0="E0002AFF" w:usb1="C0007841" w:usb2="00000009" w:usb3="00000000" w:csb0="000001FF" w:csb1="00000000"/>
+  </w:font>
+  <w:font w:name="Cambria">
+    <w:panose1 w:val="02040503050406030204"/>
+    <w:charset w:val="00"/>
+    <w:family w:val="auto"/>
+    <w:pitch w:val="variable"/>
+    <w:sig w:usb0="E00002FF" w:usb1="400004FF" w:usb2="00000000" w:usb3="00000000" w:csb0="0000019F" w:csb1="00000000"/>
+  </w:font>
+  <w:font w:name="ＭＳ 明朝">
+    <w:panose1 w:val="00000000000000000000"/>
+    <w:charset w:val="80"/>
+    <w:family w:val="roman"/>
+    <w:notTrueType/>
+    <w:pitch w:val="fixed"/>
+    <w:sig w:usb0="00000001" w:usb1="08070000" w:usb2="00000010" w:usb3="00000000" w:csb0="00020000" w:csb1="00000000"/>
+  </w:font>
+  <w:font w:name="Calibri">
+    <w:panose1 w:val="020F0502020204030204"/>
+    <w:charset w:val="00"/>
+    <w:family w:val="auto"/>
+    <w:pitch w:val="variable"/>
+    <w:sig w:usb0="E10002FF" w:usb1="4000ACFF" w:usb2="00000009" w:usb3="00000000" w:csb0="0000019F" w:csb1="00000000"/>
+  </w:font>
+  <w:font w:name="ＭＳ ゴシック">
+    <w:panose1 w:val="00000000000000000000"/>
+    <w:charset w:val="80"/>
+    <w:family w:val="modern"/>
+    <w:notTrueType/>
+    <w:pitch w:val="fixed"/>
+    <w:sig w:usb0="00000001" w:usb1="08070000" w:usb2="00000010" w:usb3="00000000" w:csb0="00020000" w:csb1="00000000"/>
+  </w:font>
+  <w:font w:name="Courier">
+    <w:panose1 w:val="02000500000000000000"/>
+    <w:charset w:val="00"/>
+    <w:family w:val="auto"/>
+    <w:pitch w:val="variable"/>
+    <w:sig w:usb0="00000003" w:usb1="00000000" w:usb2="00000000" w:usb3="00000000" w:csb0="00000001" w:csb1="00000000"/>
+  </w:font>
+  <w:font w:name="Arial">
+    <w:panose1 w:val="020B0604020202020204"/>
+    <w:charset w:val="00"/>
+    <w:family w:val="auto"/>
+    <w:pitch w:val="variable"/>
+    <w:sig w:usb0="E0002AFF" w:usb1="C0007843" w:usb2="00000009" w:usb3="00000000" w:csb0="000001FF" w:csb1="00000000"/>
+  </w:font>
+</w:fonts>
+</file>
+
+<file path=word\numbering.xml><?xml version="1.0" encoding="utf-8"?>
 <w:numbering xmlns:wpc="http://schemas.microsoft.com/office/word/2010/wordprocessingCanvas" xmlns:mo="http://schemas.microsoft.com/office/mac/office/2008/main" xmlns:mc="http://schemas.openxmlformats.org/markup-compatibility/2006" xmlns:mv="urn:schemas-microsoft-com:mac:vml" xmlns:o="urn:schemas-microsoft-com:office:office" xmlns:r="http://schemas.openxmlformats.org/officeDocument/2006/relationships" xmlns:m="http://schemas.openxmlformats.org/officeDocument/2006/math" xmlns:v="urn:schemas-microsoft-com:vml" xmlns:wp14="http://schemas.microsoft.com/office/word/2010/wordprocessingDrawing" xmlns:wp="http://schemas.openxmlformats.org/drawingml/2006/wordprocessingDrawing" xmlns:w10="urn:schemas-microsoft-com:office:word" xmlns:w="http://schemas.openxmlformats.org/wordprocessingml/2006/main" xmlns:w14="http://schemas.microsoft.com/office/word/2010/wordml" xmlns:wpg="http://schemas.microsoft.com/office/word/2010/wordprocessingGroup" xmlns:wpi="http://schemas.microsoft.com/office/word/2010/wordprocessingInk" xmlns:wne="http://schemas.microsoft.com/office/word/2006/wordml" xmlns:wps="http://schemas.microsoft.com/office/word/2010/wordprocessingShape" mc:Ignorable="w14 wp14">
   <w:abstractNum w:abstractNumId="0">
     <w:nsid w:val="FFFFFF7C"/>
@@ -2262,7 +2390,62 @@
 </w:numbering>
 </file>
 
-<file path=word/styles.xml><?xml version="1.0" encoding="utf-8"?>
+<file path=word\settings.xml><?xml version="1.0" encoding="utf-8"?>
+<w:settings xmlns:mc="http://schemas.openxmlformats.org/markup-compatibility/2006" xmlns:o="urn:schemas-microsoft-com:office:office" xmlns:r="http://schemas.openxmlformats.org/officeDocument/2006/relationships" xmlns:m="http://schemas.openxmlformats.org/officeDocument/2006/math" xmlns:v="urn:schemas-microsoft-com:vml" xmlns:w10="urn:schemas-microsoft-com:office:word" xmlns:w="http://schemas.openxmlformats.org/wordprocessingml/2006/main" xmlns:w14="http://schemas.microsoft.com/office/word/2010/wordml" xmlns:sl="http://schemas.openxmlformats.org/schemaLibrary/2006/main" mc:Ignorable="w14">
+  <w:zoom w:val="bestFit"/>
+  <w:proofState w:spelling="clean" w:grammar="clean"/>
+  <w:defaultTabStop w:val="720"/>
+  <w:characterSpacingControl w:val="doNotCompress"/>
+  <w:savePreviewPicture/>
+  <w:compat>
+    <w:useFELayout/>
+    <w:compatSetting w:name="compatibilityMode" w:uri="http://schemas.microsoft.com/office/word" w:val="14"/>
+    <w:compatSetting w:name="overrideTableStyleFontSizeAndJustification" w:uri="http://schemas.microsoft.com/office/word" w:val="1"/>
+    <w:compatSetting w:name="enableOpenTypeFeatures" w:uri="http://schemas.microsoft.com/office/word" w:val="1"/>
+    <w:compatSetting w:name="doNotFlipMirrorIndents" w:uri="http://schemas.microsoft.com/office/word" w:val="1"/>
+  </w:compat>
+  <w:rsids>
+    <w:rsidRoot w:val="00B47730"/>
+    <w:rsid w:val="00034616"/>
+    <w:rsid w:val="0006063C"/>
+    <w:rsid w:val="0015074B"/>
+    <w:rsid w:val="0029639D"/>
+    <w:rsid w:val="00326F90"/>
+    <w:rsid w:val="00AA1D8D"/>
+    <w:rsid w:val="00B47730"/>
+    <w:rsid w:val="00CB0664"/>
+    <w:rsid w:val="00FC693F"/>
+  </w:rsids>
+  <m:mathPr>
+    <m:mathFont m:val="Cambria Math"/>
+    <m:brkBin m:val="before"/>
+    <m:brkBinSub m:val="--"/>
+    <m:smallFrac m:val="0"/>
+    <m:dispDef/>
+    <m:lMargin m:val="0"/>
+    <m:rMargin m:val="0"/>
+    <m:defJc m:val="centerGroup"/>
+    <m:wrapIndent m:val="1440"/>
+    <m:intLim m:val="subSup"/>
+    <m:naryLim m:val="undOvr"/>
+  </m:mathPr>
+  <w:themeFontLang w:val="en-US" w:eastAsia="ja-JP"/>
+  <w:clrSchemeMapping w:bg1="light1" w:t1="dark1" w:bg2="light2" w:t2="dark2" w:accent1="accent1" w:accent2="accent2" w:accent3="accent3" w:accent4="accent4" w:accent5="accent5" w:accent6="accent6" w:hyperlink="hyperlink" w:followedHyperlink="followedHyperlink"/>
+  <w:doNotAutoCompressPictures/>
+  <w:shapeDefaults>
+    <o:shapedefaults v:ext="edit" spidmax="1027"/>
+    <o:shapelayout v:ext="edit">
+      <o:idmap v:ext="edit" data="1"/>
+    </o:shapelayout>
+  </w:shapeDefaults>
+  <w:decimalSymbol w:val="."/>
+  <w:listSeparator w:val=","/>
+  <w14:docId w14:val="24062061"/>
+  <w14:defaultImageDpi w14:val="300"/>
+</w:settings>
+</file>
+
+<file path=word\styles.xml><?xml version="1.0" encoding="utf-8"?>
 <w:styles xmlns:mc="http://schemas.openxmlformats.org/markup-compatibility/2006" xmlns:r="http://schemas.openxmlformats.org/officeDocument/2006/relationships" xmlns:w="http://schemas.openxmlformats.org/wordprocessingml/2006/main" xmlns:w14="http://schemas.microsoft.com/office/word/2010/wordml" mc:Ignorable="w14">
   <w:docDefaults>
     <w:rPrDefault>
@@ -14112,7 +14295,7 @@
 </w:styles>
 </file>
 
-<file path=word/stylesWithEffects.xml><?xml version="1.0" encoding="utf-8"?>
+<file path=word\stylesWithEffects.xml><?xml version="1.0" encoding="utf-8"?>
 <w:styles xmlns:wpc="http://schemas.microsoft.com/office/word/2010/wordprocessingCanvas" xmlns:mo="http://schemas.microsoft.com/office/mac/office/2008/main" xmlns:mc="http://schemas.openxmlformats.org/markup-compatibility/2006" xmlns:mv="urn:schemas-microsoft-com:mac:vml" xmlns:o="urn:schemas-microsoft-com:office:office" xmlns:r="http://schemas.openxmlformats.org/officeDocument/2006/relationships" xmlns:m="http://schemas.openxmlformats.org/officeDocument/2006/math" xmlns:v="urn:schemas-microsoft-com:vml" xmlns:wp14="http://schemas.microsoft.com/office/word/2010/wordprocessingDrawing" xmlns:wp="http://schemas.openxmlformats.org/drawingml/2006/wordprocessingDrawing" xmlns:w10="urn:schemas-microsoft-com:office:word" xmlns:w="http://schemas.openxmlformats.org/wordprocessingml/2006/main" xmlns:w14="http://schemas.microsoft.com/office/word/2010/wordml" xmlns:wpg="http://schemas.microsoft.com/office/word/2010/wordprocessingGroup" xmlns:wpi="http://schemas.microsoft.com/office/word/2010/wordprocessingInk" xmlns:wne="http://schemas.microsoft.com/office/word/2006/wordml" xmlns:wps="http://schemas.microsoft.com/office/word/2010/wordprocessingShape" mc:Ignorable="w14 wp14">
   <w:docDefaults>
     <w:rPrDefault>
@@ -25914,7 +26097,7 @@
 </w:styles>
 </file>
 
-<file path=word/theme/theme1.xml><?xml version="1.0" encoding="utf-8"?>
+<file path=word\theme\theme1.xml><?xml version="1.0" encoding="utf-8"?>
 <a:theme xmlns:a="http://schemas.openxmlformats.org/drawingml/2006/main" name="Office Theme">
   <a:themeElements>
     <a:clrScheme name="Office">
@@ -26234,14 +26417,9 @@
 </a:theme>
 </file>
 
-<file path=customXml/item1.xml><?xml version="1.0" encoding="utf-8"?>
-<b:Sources xmlns:b="http://schemas.openxmlformats.org/officeDocument/2006/bibliography" xmlns="http://schemas.openxmlformats.org/officeDocument/2006/bibliography" SelectedStyle="/APA.XSL" StyleName="APA"/>
-</file>
-
-<file path=customXml/itemProps1.xml><?xml version="1.0" encoding="utf-8"?>
-<ds:datastoreItem xmlns:ds="http://schemas.openxmlformats.org/officeDocument/2006/customXml" ds:itemID="{EF278816-EC6F-A645-907D-7F25AECB1D4A}">
-  <ds:schemaRefs>
-    <ds:schemaRef ds:uri="http://schemas.openxmlformats.org/officeDocument/2006/bibliography"/>
-  </ds:schemaRefs>
-</ds:datastoreItem>
+<file path=word\webSettings.xml><?xml version="1.0" encoding="utf-8"?>
+<w:webSettings xmlns:mc="http://schemas.openxmlformats.org/markup-compatibility/2006" xmlns:r="http://schemas.openxmlformats.org/officeDocument/2006/relationships" xmlns:w="http://schemas.openxmlformats.org/wordprocessingml/2006/main" xmlns:w14="http://schemas.microsoft.com/office/word/2010/wordml" mc:Ignorable="w14">
+  <w:allowPNG/>
+  <w:doNotSaveAsSingleFile/>
+</w:webSettings>
 </file>
</xml_diff>